<commit_message>
new test of the model
</commit_message>
<xml_diff>
--- a/_Clusterization/Investigadores y keywords/Pruebas clustering.docx
+++ b/_Clusterization/Investigadores y keywords/Pruebas clustering.docx
@@ -361,6 +361,9 @@
     </w:p>
     <w:p>
       <w:r>
+        <w:rPr>
+          <w:noProof/>
+        </w:rPr>
         <w:drawing>
           <wp:inline distT="0" distB="0" distL="0" distR="0" wp14:anchorId="72C49570" wp14:editId="21082E80">
             <wp:extent cx="5400040" cy="2898140"/>
@@ -399,32 +402,21 @@
       </w:r>
     </w:p>
     <w:p>
-      <w:proofErr w:type="spellStart"/>
       <w:r>
         <w:rPr>
           <w:i/>
           <w:iCs/>
         </w:rPr>
         <w:lastRenderedPageBreak/>
-        <w:t>Dendrograma</w:t>
-      </w:r>
-      <w:proofErr w:type="spellEnd"/>
-      <w:r>
-        <w:rPr>
-          <w:i/>
-          <w:iCs/>
-        </w:rPr>
-        <w:t xml:space="preserve">: </w:t>
+        <w:t xml:space="preserve">Dendrograma: </w:t>
       </w:r>
       <w:r>
         <w:t xml:space="preserve">muestra 10 </w:t>
       </w:r>
-      <w:proofErr w:type="spellStart"/>
       <w:proofErr w:type="gramStart"/>
       <w:r>
         <w:t>clusters</w:t>
       </w:r>
-      <w:proofErr w:type="spellEnd"/>
       <w:proofErr w:type="gramEnd"/>
       <w:r>
         <w:t xml:space="preserve"> diferenciados, con algunos compactos y otros más heterogéneos.</w:t>
@@ -435,6 +427,9 @@
         <w:jc w:val="center"/>
       </w:pPr>
       <w:r>
+        <w:rPr>
+          <w:noProof/>
+        </w:rPr>
         <w:drawing>
           <wp:inline distT="0" distB="0" distL="0" distR="0" wp14:anchorId="09E6DEF5" wp14:editId="663B7679">
             <wp:extent cx="4619352" cy="2581275"/>
@@ -508,12 +503,10 @@
       <w:r>
         <w:t xml:space="preserve">solo algunos </w:t>
       </w:r>
-      <w:proofErr w:type="spellStart"/>
       <w:proofErr w:type="gramStart"/>
       <w:r>
         <w:t>clusters</w:t>
       </w:r>
-      <w:proofErr w:type="spellEnd"/>
       <w:proofErr w:type="gramEnd"/>
       <w:r>
         <w:t xml:space="preserve"> son muy sólidos, mientras que otros presentan miembros en la frontera o mal asignados (valores cercanos a 0 o negativos).</w:t>
@@ -524,6 +517,9 @@
         <w:jc w:val="center"/>
       </w:pPr>
       <w:r>
+        <w:rPr>
+          <w:noProof/>
+        </w:rPr>
         <w:drawing>
           <wp:inline distT="0" distB="0" distL="0" distR="0" wp14:anchorId="4DA7739D" wp14:editId="74E07753">
             <wp:extent cx="4371405" cy="2409825"/>
@@ -600,12 +596,10 @@
       <w:r>
         <w:t xml:space="preserve">Algunos </w:t>
       </w:r>
-      <w:proofErr w:type="spellStart"/>
       <w:proofErr w:type="gramStart"/>
       <w:r>
         <w:t>clusters</w:t>
       </w:r>
-      <w:proofErr w:type="spellEnd"/>
       <w:proofErr w:type="gramEnd"/>
       <w:r>
         <w:t xml:space="preserve"> fuertes y muy compactos, lo que indica áreas temáticas bien definidas; otros son difusos, reflejando intersección entre perfiles de investigadores.</w:t>
@@ -653,6 +647,755 @@
         <w:t>-----------------------------------------------------------------------------------------------------------------</w:t>
       </w:r>
     </w:p>
+    <w:p>
+      <w:pPr>
+        <w:rPr>
+          <w:i/>
+          <w:iCs/>
+          <w:u w:val="single"/>
+        </w:rPr>
+      </w:pPr>
+      <w:r>
+        <w:rPr>
+          <w:i/>
+          <w:iCs/>
+          <w:u w:val="single"/>
+        </w:rPr>
+        <w:lastRenderedPageBreak/>
+        <w:t>Fecha: 2025-</w:t>
+      </w:r>
+      <w:r>
+        <w:rPr>
+          <w:i/>
+          <w:iCs/>
+          <w:u w:val="single"/>
+        </w:rPr>
+        <w:t>10</w:t>
+      </w:r>
+      <w:r>
+        <w:rPr>
+          <w:i/>
+          <w:iCs/>
+          <w:u w:val="single"/>
+        </w:rPr>
+        <w:t>-</w:t>
+      </w:r>
+      <w:r>
+        <w:rPr>
+          <w:i/>
+          <w:iCs/>
+          <w:u w:val="single"/>
+        </w:rPr>
+        <w:t>01</w:t>
+      </w:r>
+    </w:p>
+    <w:p>
+      <w:pPr>
+        <w:rPr>
+          <w:i/>
+          <w:iCs/>
+          <w:u w:val="single"/>
+        </w:rPr>
+      </w:pPr>
+      <w:r>
+        <w:rPr>
+          <w:i/>
+          <w:iCs/>
+          <w:u w:val="single"/>
+        </w:rPr>
+        <w:t>Euclidean</w:t>
+      </w:r>
+      <w:r>
+        <w:rPr>
+          <w:i/>
+          <w:iCs/>
+          <w:u w:val="single"/>
+        </w:rPr>
+        <w:t xml:space="preserve"> + Jerárquico</w:t>
+      </w:r>
+    </w:p>
+    <w:p>
+      <w:r>
+        <w:rPr>
+          <w:b/>
+          <w:bCs/>
+        </w:rPr>
+        <w:t>Configuración del modelo</w:t>
+      </w:r>
+    </w:p>
+    <w:p>
+      <w:r>
+        <w:t>Umbral: &gt;10 apariciones</w:t>
+      </w:r>
+    </w:p>
+    <w:p>
+      <w:r>
+        <w:t>Preprocesamiento: ninguno</w:t>
+      </w:r>
+    </w:p>
+    <w:p>
+      <w:r>
+        <w:t xml:space="preserve">Métrica de distancia: </w:t>
+      </w:r>
+      <w:r>
+        <w:t>Euclídea</w:t>
+      </w:r>
+    </w:p>
+    <w:p>
+      <w:r>
+        <w:t xml:space="preserve">Método de </w:t>
+      </w:r>
+      <w:proofErr w:type="spellStart"/>
+      <w:r>
+        <w:t>clustering</w:t>
+      </w:r>
+      <w:proofErr w:type="spellEnd"/>
+      <w:r>
+        <w:t>: Jerárquico (</w:t>
+      </w:r>
+      <w:proofErr w:type="spellStart"/>
+      <w:r>
+        <w:t>hclust</w:t>
+      </w:r>
+      <w:proofErr w:type="spellEnd"/>
+      <w:r>
+        <w:t>)</w:t>
+      </w:r>
+    </w:p>
+    <w:p>
+      <w:r>
+        <w:t xml:space="preserve">Parámetros específicos: </w:t>
+      </w:r>
+      <w:proofErr w:type="spellStart"/>
+      <w:r>
+        <w:t>linkage</w:t>
+      </w:r>
+      <w:proofErr w:type="spellEnd"/>
+      <w:r>
+        <w:t xml:space="preserve"> = </w:t>
+      </w:r>
+      <w:proofErr w:type="gramStart"/>
+      <w:r>
+        <w:t>ward.D</w:t>
+      </w:r>
+      <w:proofErr w:type="gramEnd"/>
+      <w:r>
+        <w:t>2</w:t>
+      </w:r>
+    </w:p>
+    <w:p>
+      <w:r>
+        <w:rPr>
+          <w:b/>
+          <w:bCs/>
+        </w:rPr>
+        <w:t>Evaluación</w:t>
+      </w:r>
+    </w:p>
+    <w:p>
+      <w:r>
+        <w:t>Rango de k probado: 2–12</w:t>
+      </w:r>
+    </w:p>
+    <w:p>
+      <w:pPr>
+        <w:spacing w:after="0"/>
+      </w:pPr>
+      <w:r>
+        <w:t>Resultados numéricos (</w:t>
+      </w:r>
+      <w:proofErr w:type="spellStart"/>
+      <w:r>
+        <w:t>Silhouette</w:t>
+      </w:r>
+      <w:proofErr w:type="spellEnd"/>
+      <w:r>
+        <w:t xml:space="preserve"> media):</w:t>
+      </w:r>
+    </w:p>
+    <w:p>
+      <w:pPr>
+        <w:spacing w:after="0"/>
+        <w:rPr>
+          <w:sz w:val="20"/>
+          <w:szCs w:val="20"/>
+        </w:rPr>
+      </w:pPr>
+      <w:r>
+        <w:rPr>
+          <w:sz w:val="20"/>
+          <w:szCs w:val="20"/>
+        </w:rPr>
+        <w:t>k=2 → 0.</w:t>
+      </w:r>
+      <w:r>
+        <w:rPr>
+          <w:sz w:val="20"/>
+          <w:szCs w:val="20"/>
+        </w:rPr>
+        <w:t xml:space="preserve">21 </w:t>
+      </w:r>
+      <w:r>
+        <w:rPr>
+          <w:sz w:val="20"/>
+          <w:szCs w:val="20"/>
+        </w:rPr>
+        <w:t>(máximo)</w:t>
+      </w:r>
+    </w:p>
+    <w:p>
+      <w:pPr>
+        <w:spacing w:after="0"/>
+        <w:rPr>
+          <w:sz w:val="20"/>
+          <w:szCs w:val="20"/>
+        </w:rPr>
+      </w:pPr>
+      <w:r>
+        <w:rPr>
+          <w:sz w:val="20"/>
+          <w:szCs w:val="20"/>
+        </w:rPr>
+        <w:t>k=3 → 0.1</w:t>
+      </w:r>
+      <w:r>
+        <w:rPr>
+          <w:sz w:val="20"/>
+          <w:szCs w:val="20"/>
+        </w:rPr>
+        <w:t>02</w:t>
+      </w:r>
+    </w:p>
+    <w:p>
+      <w:pPr>
+        <w:spacing w:after="0"/>
+        <w:rPr>
+          <w:sz w:val="20"/>
+          <w:szCs w:val="20"/>
+        </w:rPr>
+      </w:pPr>
+      <w:r>
+        <w:rPr>
+          <w:sz w:val="20"/>
+          <w:szCs w:val="20"/>
+        </w:rPr>
+        <w:t>k=4 → 0.</w:t>
+      </w:r>
+      <w:r>
+        <w:rPr>
+          <w:sz w:val="20"/>
+          <w:szCs w:val="20"/>
+        </w:rPr>
+        <w:t>107</w:t>
+      </w:r>
+    </w:p>
+    <w:p>
+      <w:pPr>
+        <w:spacing w:after="0"/>
+        <w:rPr>
+          <w:sz w:val="20"/>
+          <w:szCs w:val="20"/>
+        </w:rPr>
+      </w:pPr>
+      <w:r>
+        <w:rPr>
+          <w:sz w:val="20"/>
+          <w:szCs w:val="20"/>
+        </w:rPr>
+        <w:t>k=5 → 0.</w:t>
+      </w:r>
+      <w:r>
+        <w:rPr>
+          <w:sz w:val="20"/>
+          <w:szCs w:val="20"/>
+        </w:rPr>
+        <w:t>118</w:t>
+      </w:r>
+    </w:p>
+    <w:p>
+      <w:pPr>
+        <w:spacing w:after="0"/>
+        <w:rPr>
+          <w:sz w:val="20"/>
+          <w:szCs w:val="20"/>
+        </w:rPr>
+      </w:pPr>
+      <w:r>
+        <w:rPr>
+          <w:sz w:val="20"/>
+          <w:szCs w:val="20"/>
+        </w:rPr>
+        <w:t>k=6 → 0.</w:t>
+      </w:r>
+      <w:r>
+        <w:rPr>
+          <w:sz w:val="20"/>
+          <w:szCs w:val="20"/>
+        </w:rPr>
+        <w:t>097</w:t>
+      </w:r>
+    </w:p>
+    <w:p>
+      <w:pPr>
+        <w:spacing w:after="0"/>
+        <w:rPr>
+          <w:sz w:val="20"/>
+          <w:szCs w:val="20"/>
+        </w:rPr>
+      </w:pPr>
+      <w:r>
+        <w:rPr>
+          <w:sz w:val="20"/>
+          <w:szCs w:val="20"/>
+        </w:rPr>
+        <w:t>k=7 → 0.</w:t>
+      </w:r>
+      <w:r>
+        <w:rPr>
+          <w:sz w:val="20"/>
+          <w:szCs w:val="20"/>
+        </w:rPr>
+        <w:t>108</w:t>
+      </w:r>
+    </w:p>
+    <w:p>
+      <w:pPr>
+        <w:spacing w:after="0"/>
+        <w:rPr>
+          <w:sz w:val="20"/>
+          <w:szCs w:val="20"/>
+        </w:rPr>
+      </w:pPr>
+      <w:r>
+        <w:rPr>
+          <w:sz w:val="20"/>
+          <w:szCs w:val="20"/>
+        </w:rPr>
+        <w:t>k=8 → 0.1</w:t>
+      </w:r>
+      <w:r>
+        <w:rPr>
+          <w:sz w:val="20"/>
+          <w:szCs w:val="20"/>
+        </w:rPr>
+        <w:t>12</w:t>
+      </w:r>
+    </w:p>
+    <w:p>
+      <w:pPr>
+        <w:spacing w:after="0"/>
+        <w:rPr>
+          <w:sz w:val="20"/>
+          <w:szCs w:val="20"/>
+        </w:rPr>
+      </w:pPr>
+      <w:r>
+        <w:rPr>
+          <w:sz w:val="20"/>
+          <w:szCs w:val="20"/>
+        </w:rPr>
+        <w:t>k=9 → 0.1</w:t>
+      </w:r>
+      <w:r>
+        <w:rPr>
+          <w:sz w:val="20"/>
+          <w:szCs w:val="20"/>
+        </w:rPr>
+        <w:t>15</w:t>
+      </w:r>
+    </w:p>
+    <w:p>
+      <w:pPr>
+        <w:spacing w:after="0"/>
+        <w:rPr>
+          <w:sz w:val="20"/>
+          <w:szCs w:val="20"/>
+        </w:rPr>
+      </w:pPr>
+      <w:r>
+        <w:rPr>
+          <w:sz w:val="20"/>
+          <w:szCs w:val="20"/>
+        </w:rPr>
+        <w:t>k=10 → 0.</w:t>
+      </w:r>
+      <w:r>
+        <w:rPr>
+          <w:sz w:val="20"/>
+          <w:szCs w:val="20"/>
+        </w:rPr>
+        <w:t>114</w:t>
+      </w:r>
+      <w:r>
+        <w:rPr>
+          <w:sz w:val="20"/>
+          <w:szCs w:val="20"/>
+        </w:rPr>
+        <w:t xml:space="preserve"> </w:t>
+      </w:r>
+    </w:p>
+    <w:p>
+      <w:pPr>
+        <w:spacing w:after="0"/>
+        <w:rPr>
+          <w:sz w:val="20"/>
+          <w:szCs w:val="20"/>
+        </w:rPr>
+      </w:pPr>
+      <w:r>
+        <w:rPr>
+          <w:sz w:val="20"/>
+          <w:szCs w:val="20"/>
+        </w:rPr>
+        <w:t>k=11 → 0.</w:t>
+      </w:r>
+      <w:r>
+        <w:rPr>
+          <w:sz w:val="20"/>
+          <w:szCs w:val="20"/>
+        </w:rPr>
+        <w:t>113</w:t>
+      </w:r>
+    </w:p>
+    <w:p>
+      <w:pPr>
+        <w:spacing w:after="0"/>
+        <w:rPr>
+          <w:sz w:val="20"/>
+          <w:szCs w:val="20"/>
+        </w:rPr>
+      </w:pPr>
+      <w:r>
+        <w:rPr>
+          <w:sz w:val="20"/>
+          <w:szCs w:val="20"/>
+        </w:rPr>
+        <w:t>k=12 → 0.</w:t>
+      </w:r>
+      <w:r>
+        <w:rPr>
+          <w:sz w:val="20"/>
+          <w:szCs w:val="20"/>
+        </w:rPr>
+        <w:t>114</w:t>
+      </w:r>
+    </w:p>
+    <w:p>
+      <w:r>
+        <w:t xml:space="preserve">Mejor k (según </w:t>
+      </w:r>
+      <w:proofErr w:type="spellStart"/>
+      <w:r>
+        <w:t>S</w:t>
+      </w:r>
+      <w:r>
+        <w:t>ilhouette</w:t>
+      </w:r>
+      <w:proofErr w:type="spellEnd"/>
+      <w:r>
+        <w:t xml:space="preserve">): </w:t>
+      </w:r>
+      <w:r>
+        <w:t>2</w:t>
+      </w:r>
+      <w:r>
+        <w:t xml:space="preserve"> (valor ≈ 0.2</w:t>
+      </w:r>
+      <w:r>
+        <w:t>1</w:t>
+      </w:r>
+      <w:r>
+        <w:t>)</w:t>
+      </w:r>
+    </w:p>
+    <w:p>
+      <w:pPr>
+        <w:rPr>
+          <w:b/>
+          <w:bCs/>
+        </w:rPr>
+      </w:pPr>
+      <w:r>
+        <w:rPr>
+          <w:b/>
+          <w:bCs/>
+        </w:rPr>
+        <w:t>Visualizaciones</w:t>
+      </w:r>
+    </w:p>
+    <w:p>
+      <w:r>
+        <w:rPr>
+          <w:i/>
+          <w:iCs/>
+        </w:rPr>
+        <w:t>MDS 2D sobre Jaccard + Jerárquico</w:t>
+      </w:r>
+      <w:r>
+        <w:t xml:space="preserve">: </w:t>
+      </w:r>
+      <w:r>
+        <w:t xml:space="preserve">se distinguen dos grandes grupos de investigadores, con una separación clara en el plano. Uno de los </w:t>
+      </w:r>
+      <w:r>
+        <w:t>clústers</w:t>
+      </w:r>
+      <w:r>
+        <w:t xml:space="preserve"> aparece más compacto, mientras que el otro es más disperso, lo que refleja cierta heterogeneidad </w:t>
+      </w:r>
+      <w:r>
+        <w:t>interna.</w:t>
+      </w:r>
+    </w:p>
+    <w:p>
+      <w:pPr>
+        <w:jc w:val="center"/>
+      </w:pPr>
+      <w:r>
+        <w:drawing>
+          <wp:inline distT="0" distB="0" distL="0" distR="0" wp14:anchorId="4073F72B" wp14:editId="452F11ED">
+            <wp:extent cx="4352925" cy="2356640"/>
+            <wp:effectExtent l="0" t="0" r="0" b="5715"/>
+            <wp:docPr id="148888967" name="Imagen 1" descr="Gráfico, Gráfico de dispersión&#10;&#10;El contenido generado por IA puede ser incorrecto."/>
+            <wp:cNvGraphicFramePr>
+              <a:graphicFrameLocks xmlns:a="http://schemas.openxmlformats.org/drawingml/2006/main" noChangeAspect="1"/>
+            </wp:cNvGraphicFramePr>
+            <a:graphic xmlns:a="http://schemas.openxmlformats.org/drawingml/2006/main">
+              <a:graphicData uri="http://schemas.openxmlformats.org/drawingml/2006/picture">
+                <pic:pic xmlns:pic="http://schemas.openxmlformats.org/drawingml/2006/picture">
+                  <pic:nvPicPr>
+                    <pic:cNvPr id="148888967" name="Imagen 1" descr="Gráfico, Gráfico de dispersión&#10;&#10;El contenido generado por IA puede ser incorrecto."/>
+                    <pic:cNvPicPr/>
+                  </pic:nvPicPr>
+                  <pic:blipFill>
+                    <a:blip r:embed="rId7"/>
+                    <a:stretch>
+                      <a:fillRect/>
+                    </a:stretch>
+                  </pic:blipFill>
+                  <pic:spPr>
+                    <a:xfrm>
+                      <a:off x="0" y="0"/>
+                      <a:ext cx="4359979" cy="2360459"/>
+                    </a:xfrm>
+                    <a:prstGeom prst="rect">
+                      <a:avLst/>
+                    </a:prstGeom>
+                  </pic:spPr>
+                </pic:pic>
+              </a:graphicData>
+            </a:graphic>
+          </wp:inline>
+        </w:drawing>
+      </w:r>
+    </w:p>
+    <w:p>
+      <w:pPr>
+        <w:jc w:val="center"/>
+      </w:pPr>
+      <w:r>
+        <w:rPr>
+          <w:i/>
+          <w:iCs/>
+        </w:rPr>
+        <w:lastRenderedPageBreak/>
+        <w:t xml:space="preserve">Dendrograma: </w:t>
+      </w:r>
+      <w:r>
+        <w:t xml:space="preserve">el agrupamiento sugiere una división principal en dos grandes </w:t>
+      </w:r>
+      <w:r>
+        <w:t>clústers</w:t>
+      </w:r>
+      <w:r>
+        <w:t xml:space="preserve">. El primero es más compacto y homogéneo, mientras que el segundo reúne a la mayoría de </w:t>
+      </w:r>
+      <w:r>
+        <w:t>los investigadores</w:t>
+      </w:r>
+      <w:r>
+        <w:t xml:space="preserve"> con mayor variabilidad interna.</w:t>
+      </w:r>
+      <w:r>
+        <w:rPr>
+          <w:noProof/>
+        </w:rPr>
+        <w:drawing>
+          <wp:inline distT="0" distB="0" distL="0" distR="0" wp14:anchorId="62DBA89E" wp14:editId="234167DC">
+            <wp:extent cx="4572000" cy="2540299"/>
+            <wp:effectExtent l="0" t="0" r="0" b="0"/>
+            <wp:docPr id="1778481386" name="Imagen 1" descr="Gráfico, Esquemático&#10;&#10;El contenido generado por IA puede ser incorrecto."/>
+            <wp:cNvGraphicFramePr>
+              <a:graphicFrameLocks xmlns:a="http://schemas.openxmlformats.org/drawingml/2006/main" noChangeAspect="1"/>
+            </wp:cNvGraphicFramePr>
+            <a:graphic xmlns:a="http://schemas.openxmlformats.org/drawingml/2006/main">
+              <a:graphicData uri="http://schemas.openxmlformats.org/drawingml/2006/picture">
+                <pic:pic xmlns:pic="http://schemas.openxmlformats.org/drawingml/2006/picture">
+                  <pic:nvPicPr>
+                    <pic:cNvPr id="1778481386" name="Imagen 1" descr="Gráfico, Esquemático&#10;&#10;El contenido generado por IA puede ser incorrecto."/>
+                    <pic:cNvPicPr/>
+                  </pic:nvPicPr>
+                  <pic:blipFill>
+                    <a:blip r:embed="rId8"/>
+                    <a:stretch>
+                      <a:fillRect/>
+                    </a:stretch>
+                  </pic:blipFill>
+                  <pic:spPr>
+                    <a:xfrm>
+                      <a:off x="0" y="0"/>
+                      <a:ext cx="4582177" cy="2545954"/>
+                    </a:xfrm>
+                    <a:prstGeom prst="rect">
+                      <a:avLst/>
+                    </a:prstGeom>
+                  </pic:spPr>
+                </pic:pic>
+              </a:graphicData>
+            </a:graphic>
+          </wp:inline>
+        </w:drawing>
+      </w:r>
+    </w:p>
+    <w:p>
+      <w:proofErr w:type="spellStart"/>
+      <w:r>
+        <w:rPr>
+          <w:i/>
+          <w:iCs/>
+        </w:rPr>
+        <w:t>Silhouette</w:t>
+      </w:r>
+      <w:proofErr w:type="spellEnd"/>
+      <w:r>
+        <w:rPr>
+          <w:i/>
+          <w:iCs/>
+        </w:rPr>
+        <w:t xml:space="preserve"> </w:t>
+      </w:r>
+      <w:proofErr w:type="spellStart"/>
+      <w:r>
+        <w:rPr>
+          <w:i/>
+          <w:iCs/>
+        </w:rPr>
+        <w:t>plot</w:t>
+      </w:r>
+      <w:proofErr w:type="spellEnd"/>
+      <w:r>
+        <w:rPr>
+          <w:i/>
+          <w:iCs/>
+        </w:rPr>
+        <w:t xml:space="preserve">: </w:t>
+      </w:r>
+      <w:r>
+        <w:t xml:space="preserve">la mayoría de los investigadores presentan valores positivos, lo que indica una asignación razonable a sus grupos. Sin embargo, los anchos de </w:t>
+      </w:r>
+      <w:proofErr w:type="spellStart"/>
+      <w:r>
+        <w:t>silhouette</w:t>
+      </w:r>
+      <w:proofErr w:type="spellEnd"/>
+      <w:r>
+        <w:t xml:space="preserve"> son bajos en general (cercanos a 0.2), lo que refleja que la separación entre los dos </w:t>
+      </w:r>
+      <w:proofErr w:type="gramStart"/>
+      <w:r>
+        <w:t>clusters</w:t>
+      </w:r>
+      <w:proofErr w:type="gramEnd"/>
+      <w:r>
+        <w:t xml:space="preserve"> es débil y existe solapamiento entre ellos.</w:t>
+      </w:r>
+    </w:p>
+    <w:p>
+      <w:pPr>
+        <w:jc w:val="center"/>
+      </w:pPr>
+      <w:r>
+        <w:drawing>
+          <wp:inline distT="0" distB="0" distL="0" distR="0" wp14:anchorId="4D1FD564" wp14:editId="0E8F4DE6">
+            <wp:extent cx="4695825" cy="2558297"/>
+            <wp:effectExtent l="0" t="0" r="0" b="0"/>
+            <wp:docPr id="576319656" name="Imagen 1" descr="Gráfico, Histograma&#10;&#10;El contenido generado por IA puede ser incorrecto."/>
+            <wp:cNvGraphicFramePr>
+              <a:graphicFrameLocks xmlns:a="http://schemas.openxmlformats.org/drawingml/2006/main" noChangeAspect="1"/>
+            </wp:cNvGraphicFramePr>
+            <a:graphic xmlns:a="http://schemas.openxmlformats.org/drawingml/2006/main">
+              <a:graphicData uri="http://schemas.openxmlformats.org/drawingml/2006/picture">
+                <pic:pic xmlns:pic="http://schemas.openxmlformats.org/drawingml/2006/picture">
+                  <pic:nvPicPr>
+                    <pic:cNvPr id="576319656" name="Imagen 1" descr="Gráfico, Histograma&#10;&#10;El contenido generado por IA puede ser incorrecto."/>
+                    <pic:cNvPicPr/>
+                  </pic:nvPicPr>
+                  <pic:blipFill>
+                    <a:blip r:embed="rId9"/>
+                    <a:stretch>
+                      <a:fillRect/>
+                    </a:stretch>
+                  </pic:blipFill>
+                  <pic:spPr>
+                    <a:xfrm>
+                      <a:off x="0" y="0"/>
+                      <a:ext cx="4711360" cy="2566761"/>
+                    </a:xfrm>
+                    <a:prstGeom prst="rect">
+                      <a:avLst/>
+                    </a:prstGeom>
+                  </pic:spPr>
+                </pic:pic>
+              </a:graphicData>
+            </a:graphic>
+          </wp:inline>
+        </w:drawing>
+      </w:r>
+    </w:p>
+    <w:p>
+      <w:r>
+        <w:rPr>
+          <w:b/>
+          <w:bCs/>
+        </w:rPr>
+        <w:t>Conclusión</w:t>
+      </w:r>
+    </w:p>
+    <w:p>
+      <w:r>
+        <w:t xml:space="preserve">El modelo con distancia euclídea sugiere principalmente una división en dos grandes grupos de investigadores. Aunque la separación es visible en el MDS y el dendrograma, los valores de </w:t>
+      </w:r>
+      <w:proofErr w:type="spellStart"/>
+      <w:r>
+        <w:t>S</w:t>
+      </w:r>
+      <w:r>
+        <w:t>ilhouette</w:t>
+      </w:r>
+      <w:proofErr w:type="spellEnd"/>
+      <w:r>
+        <w:t xml:space="preserve"> son bajos (máximo ≈ 0.21), lo que indica que los </w:t>
+      </w:r>
+      <w:proofErr w:type="gramStart"/>
+      <w:r>
+        <w:t>clusters</w:t>
+      </w:r>
+      <w:proofErr w:type="gramEnd"/>
+      <w:r>
+        <w:t xml:space="preserve"> no están bien definidos y existe solapamiento entre ellos. </w:t>
+      </w:r>
+    </w:p>
+    <w:p>
+      <w:r>
+        <w:t>En conjunto, la estructura refleja una dicotomía general en los perfiles, pero con baja cohesión interna.</w:t>
+      </w:r>
+    </w:p>
+    <w:p>
+      <w:r>
+        <w:t>-----------------------------------------------------------------------------------------------------------------</w:t>
+      </w:r>
+    </w:p>
+    <w:p/>
     <w:sectPr>
       <w:pgSz w:w="11906" w:h="16838"/>
       <w:pgMar w:top="1417" w:right="1701" w:bottom="1417" w:left="1701" w:header="708" w:footer="708" w:gutter="0"/>

</xml_diff>

<commit_message>
inconclusive weighted clustering tests
after testing various weighted clustering methods, the results improved in some situations, but generally remained the same or worse. this approach is also not suitable for the data.
</commit_message>
<xml_diff>
--- a/_Clusterization/Investigadores y keywords/Pruebas clustering.docx
+++ b/_Clusterization/Investigadores y keywords/Pruebas clustering.docx
@@ -8190,10 +8190,13 @@
         <w:t xml:space="preserve">Rango de k probado: </w:t>
       </w:r>
       <w:r>
-        <w:t>3</w:t>
-      </w:r>
-      <w:r>
-        <w:t>–12</w:t>
+        <w:t>10</w:t>
+      </w:r>
+      <w:r>
+        <w:t>–</w:t>
+      </w:r>
+      <w:r>
+        <w:t>19</w:t>
       </w:r>
     </w:p>
     <w:p>
@@ -9179,14 +9182,7 @@
           <w:sz w:val="20"/>
           <w:szCs w:val="20"/>
         </w:rPr>
-        <w:t xml:space="preserve">98 </w:t>
-      </w:r>
-      <w:r>
-        <w:rPr>
-          <w:sz w:val="20"/>
-          <w:szCs w:val="20"/>
-        </w:rPr>
-        <w:t>(máximo)</w:t>
+        <w:t>98 (máximo)</w:t>
       </w:r>
     </w:p>
     <w:p>
@@ -9642,7 +9638,168 @@
           <w:sz w:val="20"/>
           <w:szCs w:val="20"/>
         </w:rPr>
-        <w:t>139</w:t>
+        <w:t xml:space="preserve">139 </w:t>
+      </w:r>
+    </w:p>
+    <w:p>
+      <w:pPr>
+        <w:spacing w:after="0"/>
+        <w:rPr>
+          <w:sz w:val="20"/>
+          <w:szCs w:val="20"/>
+        </w:rPr>
+      </w:pPr>
+      <w:r>
+        <w:rPr>
+          <w:sz w:val="20"/>
+          <w:szCs w:val="20"/>
+        </w:rPr>
+        <w:t>k=4 → 0.</w:t>
+      </w:r>
+      <w:r>
+        <w:rPr>
+          <w:sz w:val="20"/>
+          <w:szCs w:val="20"/>
+        </w:rPr>
+        <w:t>151</w:t>
+      </w:r>
+    </w:p>
+    <w:p>
+      <w:pPr>
+        <w:spacing w:after="0"/>
+        <w:rPr>
+          <w:sz w:val="20"/>
+          <w:szCs w:val="20"/>
+        </w:rPr>
+      </w:pPr>
+      <w:r>
+        <w:rPr>
+          <w:sz w:val="20"/>
+          <w:szCs w:val="20"/>
+        </w:rPr>
+        <w:t>k=5 → 0.</w:t>
+      </w:r>
+      <w:r>
+        <w:rPr>
+          <w:sz w:val="20"/>
+          <w:szCs w:val="20"/>
+        </w:rPr>
+        <w:t xml:space="preserve">173 </w:t>
+      </w:r>
+    </w:p>
+    <w:p>
+      <w:pPr>
+        <w:spacing w:after="0"/>
+        <w:rPr>
+          <w:sz w:val="20"/>
+          <w:szCs w:val="20"/>
+        </w:rPr>
+      </w:pPr>
+      <w:r>
+        <w:rPr>
+          <w:sz w:val="20"/>
+          <w:szCs w:val="20"/>
+        </w:rPr>
+        <w:t>k=6 → 0.</w:t>
+      </w:r>
+      <w:r>
+        <w:rPr>
+          <w:sz w:val="20"/>
+          <w:szCs w:val="20"/>
+        </w:rPr>
+        <w:t>154</w:t>
+      </w:r>
+    </w:p>
+    <w:p>
+      <w:pPr>
+        <w:spacing w:after="0"/>
+        <w:rPr>
+          <w:sz w:val="20"/>
+          <w:szCs w:val="20"/>
+        </w:rPr>
+      </w:pPr>
+      <w:r>
+        <w:rPr>
+          <w:sz w:val="20"/>
+          <w:szCs w:val="20"/>
+        </w:rPr>
+        <w:t>k=7 → 0.</w:t>
+      </w:r>
+      <w:r>
+        <w:rPr>
+          <w:sz w:val="20"/>
+          <w:szCs w:val="20"/>
+        </w:rPr>
+        <w:t>148</w:t>
+      </w:r>
+    </w:p>
+    <w:p>
+      <w:pPr>
+        <w:spacing w:after="0"/>
+        <w:rPr>
+          <w:sz w:val="20"/>
+          <w:szCs w:val="20"/>
+        </w:rPr>
+      </w:pPr>
+      <w:r>
+        <w:rPr>
+          <w:sz w:val="20"/>
+          <w:szCs w:val="20"/>
+        </w:rPr>
+        <w:t>k=8 → 0.</w:t>
+      </w:r>
+      <w:r>
+        <w:rPr>
+          <w:sz w:val="20"/>
+          <w:szCs w:val="20"/>
+        </w:rPr>
+        <w:t>154</w:t>
+      </w:r>
+    </w:p>
+    <w:p>
+      <w:pPr>
+        <w:spacing w:after="0"/>
+        <w:rPr>
+          <w:sz w:val="20"/>
+          <w:szCs w:val="20"/>
+        </w:rPr>
+      </w:pPr>
+      <w:r>
+        <w:rPr>
+          <w:sz w:val="20"/>
+          <w:szCs w:val="20"/>
+        </w:rPr>
+        <w:t>k=9 → 0.</w:t>
+      </w:r>
+      <w:r>
+        <w:rPr>
+          <w:sz w:val="20"/>
+          <w:szCs w:val="20"/>
+        </w:rPr>
+        <w:t>174</w:t>
+      </w:r>
+    </w:p>
+    <w:p>
+      <w:pPr>
+        <w:spacing w:after="0"/>
+        <w:rPr>
+          <w:sz w:val="20"/>
+          <w:szCs w:val="20"/>
+        </w:rPr>
+      </w:pPr>
+      <w:r>
+        <w:rPr>
+          <w:sz w:val="20"/>
+          <w:szCs w:val="20"/>
+        </w:rPr>
+        <w:t>k=10 → 0.</w:t>
+      </w:r>
+      <w:r>
+        <w:rPr>
+          <w:sz w:val="20"/>
+          <w:szCs w:val="20"/>
+        </w:rPr>
+        <w:t>174</w:t>
       </w:r>
       <w:r>
         <w:rPr>
@@ -9651,188 +9808,6 @@
         </w:rPr>
         <w:t xml:space="preserve"> </w:t>
       </w:r>
-    </w:p>
-    <w:p>
-      <w:pPr>
-        <w:spacing w:after="0"/>
-        <w:rPr>
-          <w:sz w:val="20"/>
-          <w:szCs w:val="20"/>
-        </w:rPr>
-      </w:pPr>
-      <w:r>
-        <w:rPr>
-          <w:sz w:val="20"/>
-          <w:szCs w:val="20"/>
-        </w:rPr>
-        <w:t>k=4 → 0.</w:t>
-      </w:r>
-      <w:r>
-        <w:rPr>
-          <w:sz w:val="20"/>
-          <w:szCs w:val="20"/>
-        </w:rPr>
-        <w:t>151</w:t>
-      </w:r>
-    </w:p>
-    <w:p>
-      <w:pPr>
-        <w:spacing w:after="0"/>
-        <w:rPr>
-          <w:sz w:val="20"/>
-          <w:szCs w:val="20"/>
-        </w:rPr>
-      </w:pPr>
-      <w:r>
-        <w:rPr>
-          <w:sz w:val="20"/>
-          <w:szCs w:val="20"/>
-        </w:rPr>
-        <w:t>k=5 → 0.</w:t>
-      </w:r>
-      <w:r>
-        <w:rPr>
-          <w:sz w:val="20"/>
-          <w:szCs w:val="20"/>
-        </w:rPr>
-        <w:t>173</w:t>
-      </w:r>
-      <w:r>
-        <w:rPr>
-          <w:sz w:val="20"/>
-          <w:szCs w:val="20"/>
-        </w:rPr>
-        <w:t xml:space="preserve"> </w:t>
-      </w:r>
-    </w:p>
-    <w:p>
-      <w:pPr>
-        <w:spacing w:after="0"/>
-        <w:rPr>
-          <w:sz w:val="20"/>
-          <w:szCs w:val="20"/>
-        </w:rPr>
-      </w:pPr>
-      <w:r>
-        <w:rPr>
-          <w:sz w:val="20"/>
-          <w:szCs w:val="20"/>
-        </w:rPr>
-        <w:t>k=6 → 0.</w:t>
-      </w:r>
-      <w:r>
-        <w:rPr>
-          <w:sz w:val="20"/>
-          <w:szCs w:val="20"/>
-        </w:rPr>
-        <w:t>154</w:t>
-      </w:r>
-    </w:p>
-    <w:p>
-      <w:pPr>
-        <w:spacing w:after="0"/>
-        <w:rPr>
-          <w:sz w:val="20"/>
-          <w:szCs w:val="20"/>
-        </w:rPr>
-      </w:pPr>
-      <w:r>
-        <w:rPr>
-          <w:sz w:val="20"/>
-          <w:szCs w:val="20"/>
-        </w:rPr>
-        <w:t>k=7 → 0.</w:t>
-      </w:r>
-      <w:r>
-        <w:rPr>
-          <w:sz w:val="20"/>
-          <w:szCs w:val="20"/>
-        </w:rPr>
-        <w:t>148</w:t>
-      </w:r>
-    </w:p>
-    <w:p>
-      <w:pPr>
-        <w:spacing w:after="0"/>
-        <w:rPr>
-          <w:sz w:val="20"/>
-          <w:szCs w:val="20"/>
-        </w:rPr>
-      </w:pPr>
-      <w:r>
-        <w:rPr>
-          <w:sz w:val="20"/>
-          <w:szCs w:val="20"/>
-        </w:rPr>
-        <w:t>k=8 → 0.</w:t>
-      </w:r>
-      <w:r>
-        <w:rPr>
-          <w:sz w:val="20"/>
-          <w:szCs w:val="20"/>
-        </w:rPr>
-        <w:t>1</w:t>
-      </w:r>
-      <w:r>
-        <w:rPr>
-          <w:sz w:val="20"/>
-          <w:szCs w:val="20"/>
-        </w:rPr>
-        <w:t>54</w:t>
-      </w:r>
-    </w:p>
-    <w:p>
-      <w:pPr>
-        <w:spacing w:after="0"/>
-        <w:rPr>
-          <w:sz w:val="20"/>
-          <w:szCs w:val="20"/>
-        </w:rPr>
-      </w:pPr>
-      <w:r>
-        <w:rPr>
-          <w:sz w:val="20"/>
-          <w:szCs w:val="20"/>
-        </w:rPr>
-        <w:t>k=9 → 0.</w:t>
-      </w:r>
-      <w:r>
-        <w:rPr>
-          <w:sz w:val="20"/>
-          <w:szCs w:val="20"/>
-        </w:rPr>
-        <w:t>174</w:t>
-      </w:r>
-    </w:p>
-    <w:p>
-      <w:pPr>
-        <w:spacing w:after="0"/>
-        <w:rPr>
-          <w:sz w:val="20"/>
-          <w:szCs w:val="20"/>
-        </w:rPr>
-      </w:pPr>
-      <w:r>
-        <w:rPr>
-          <w:sz w:val="20"/>
-          <w:szCs w:val="20"/>
-        </w:rPr>
-        <w:t>k=10 → 0.</w:t>
-      </w:r>
-      <w:r>
-        <w:rPr>
-          <w:sz w:val="20"/>
-          <w:szCs w:val="20"/>
-        </w:rPr>
-        <w:t>174</w:t>
-      </w:r>
-      <w:r>
-        <w:rPr>
-          <w:sz w:val="20"/>
-          <w:szCs w:val="20"/>
-        </w:rPr>
-        <w:t xml:space="preserve"> </w:t>
-      </w:r>
       <w:r>
         <w:rPr>
           <w:sz w:val="20"/>
@@ -9883,14 +9858,7 @@
           <w:sz w:val="20"/>
           <w:szCs w:val="20"/>
         </w:rPr>
-        <w:t>1</w:t>
-      </w:r>
-      <w:r>
-        <w:rPr>
-          <w:sz w:val="20"/>
-          <w:szCs w:val="20"/>
-        </w:rPr>
-        <w:t>64</w:t>
+        <w:t>164</w:t>
       </w:r>
     </w:p>
     <w:p>
@@ -10122,15 +10090,7 @@
           <w:iCs/>
           <w:u w:val="single"/>
         </w:rPr>
-        <w:t>Manhattan</w:t>
-      </w:r>
-      <w:r>
-        <w:rPr>
-          <w:i/>
-          <w:iCs/>
-          <w:u w:val="single"/>
-        </w:rPr>
-        <w:t xml:space="preserve"> </w:t>
+        <w:t xml:space="preserve">Manhattan </w:t>
       </w:r>
       <w:r>
         <w:rPr>
@@ -10299,21 +10259,7 @@
           <w:sz w:val="20"/>
           <w:szCs w:val="20"/>
         </w:rPr>
-        <w:t>220</w:t>
-      </w:r>
-      <w:r>
-        <w:rPr>
-          <w:sz w:val="20"/>
-          <w:szCs w:val="20"/>
-        </w:rPr>
-        <w:t xml:space="preserve"> </w:t>
-      </w:r>
-      <w:r>
-        <w:rPr>
-          <w:sz w:val="20"/>
-          <w:szCs w:val="20"/>
-        </w:rPr>
-        <w:t>(máximo)</w:t>
+        <w:t>220 (máximo)</w:t>
       </w:r>
     </w:p>
     <w:p>
@@ -10359,14 +10305,7 @@
           <w:sz w:val="20"/>
           <w:szCs w:val="20"/>
         </w:rPr>
-        <w:t>1</w:t>
-      </w:r>
-      <w:r>
-        <w:rPr>
-          <w:sz w:val="20"/>
-          <w:szCs w:val="20"/>
-        </w:rPr>
-        <w:t>87</w:t>
+        <w:t>187</w:t>
       </w:r>
     </w:p>
     <w:p>
@@ -10389,14 +10328,7 @@
           <w:sz w:val="20"/>
           <w:szCs w:val="20"/>
         </w:rPr>
-        <w:t>1</w:t>
-      </w:r>
-      <w:r>
-        <w:rPr>
-          <w:sz w:val="20"/>
-          <w:szCs w:val="20"/>
-        </w:rPr>
-        <w:t>88</w:t>
+        <w:t>188</w:t>
       </w:r>
     </w:p>
     <w:p>
@@ -10419,14 +10351,7 @@
           <w:sz w:val="20"/>
           <w:szCs w:val="20"/>
         </w:rPr>
-        <w:t>1</w:t>
-      </w:r>
-      <w:r>
-        <w:rPr>
-          <w:sz w:val="20"/>
-          <w:szCs w:val="20"/>
-        </w:rPr>
-        <w:t>74</w:t>
+        <w:t>174</w:t>
       </w:r>
     </w:p>
     <w:p>
@@ -10494,14 +10419,7 @@
           <w:sz w:val="20"/>
           <w:szCs w:val="20"/>
         </w:rPr>
-        <w:t>1</w:t>
-      </w:r>
-      <w:r>
-        <w:rPr>
-          <w:sz w:val="20"/>
-          <w:szCs w:val="20"/>
-        </w:rPr>
-        <w:t>69</w:t>
+        <w:t>169</w:t>
       </w:r>
     </w:p>
     <w:p>
@@ -11031,6 +10949,9 @@
         <w:jc w:val="center"/>
       </w:pPr>
       <w:r>
+        <w:rPr>
+          <w:noProof/>
+        </w:rPr>
         <mc:AlternateContent>
           <mc:Choice Requires="wps">
             <w:drawing>
@@ -11763,6 +11684,7 @@
   <w:style w:type="character" w:default="1" w:styleId="Fuentedeprrafopredeter">
     <w:name w:val="Default Paragraph Font"/>
     <w:uiPriority w:val="1"/>
+    <w:semiHidden/>
     <w:unhideWhenUsed/>
   </w:style>
   <w:style w:type="table" w:default="1" w:styleId="Tablanormal">

</xml_diff>

<commit_message>
Weighted clustering model (#10)
* keywords without threshold

* name and new dow

changed the name of the obsolete matrix of researchers and keywords (the one with threshold = 10 due to that now I am going to try the results with weights, and I need all the words)

* weighted script creation

for kmeans and to try the symmetric penalization

* inconclusive weighted clustering tests

after testing various weighted clustering methods, the results improved in some situations, but generally remained the same or worse. this approach is also not suitable for the data.
</commit_message>
<xml_diff>
--- a/_Clusterization/Investigadores y keywords/Pruebas clustering.docx
+++ b/_Clusterization/Investigadores y keywords/Pruebas clustering.docx
@@ -8190,10 +8190,13 @@
         <w:t xml:space="preserve">Rango de k probado: </w:t>
       </w:r>
       <w:r>
-        <w:t>3</w:t>
-      </w:r>
-      <w:r>
-        <w:t>–12</w:t>
+        <w:t>10</w:t>
+      </w:r>
+      <w:r>
+        <w:t>–</w:t>
+      </w:r>
+      <w:r>
+        <w:t>19</w:t>
       </w:r>
     </w:p>
     <w:p>
@@ -9179,14 +9182,7 @@
           <w:sz w:val="20"/>
           <w:szCs w:val="20"/>
         </w:rPr>
-        <w:t xml:space="preserve">98 </w:t>
-      </w:r>
-      <w:r>
-        <w:rPr>
-          <w:sz w:val="20"/>
-          <w:szCs w:val="20"/>
-        </w:rPr>
-        <w:t>(máximo)</w:t>
+        <w:t>98 (máximo)</w:t>
       </w:r>
     </w:p>
     <w:p>
@@ -9642,7 +9638,168 @@
           <w:sz w:val="20"/>
           <w:szCs w:val="20"/>
         </w:rPr>
-        <w:t>139</w:t>
+        <w:t xml:space="preserve">139 </w:t>
+      </w:r>
+    </w:p>
+    <w:p>
+      <w:pPr>
+        <w:spacing w:after="0"/>
+        <w:rPr>
+          <w:sz w:val="20"/>
+          <w:szCs w:val="20"/>
+        </w:rPr>
+      </w:pPr>
+      <w:r>
+        <w:rPr>
+          <w:sz w:val="20"/>
+          <w:szCs w:val="20"/>
+        </w:rPr>
+        <w:t>k=4 → 0.</w:t>
+      </w:r>
+      <w:r>
+        <w:rPr>
+          <w:sz w:val="20"/>
+          <w:szCs w:val="20"/>
+        </w:rPr>
+        <w:t>151</w:t>
+      </w:r>
+    </w:p>
+    <w:p>
+      <w:pPr>
+        <w:spacing w:after="0"/>
+        <w:rPr>
+          <w:sz w:val="20"/>
+          <w:szCs w:val="20"/>
+        </w:rPr>
+      </w:pPr>
+      <w:r>
+        <w:rPr>
+          <w:sz w:val="20"/>
+          <w:szCs w:val="20"/>
+        </w:rPr>
+        <w:t>k=5 → 0.</w:t>
+      </w:r>
+      <w:r>
+        <w:rPr>
+          <w:sz w:val="20"/>
+          <w:szCs w:val="20"/>
+        </w:rPr>
+        <w:t xml:space="preserve">173 </w:t>
+      </w:r>
+    </w:p>
+    <w:p>
+      <w:pPr>
+        <w:spacing w:after="0"/>
+        <w:rPr>
+          <w:sz w:val="20"/>
+          <w:szCs w:val="20"/>
+        </w:rPr>
+      </w:pPr>
+      <w:r>
+        <w:rPr>
+          <w:sz w:val="20"/>
+          <w:szCs w:val="20"/>
+        </w:rPr>
+        <w:t>k=6 → 0.</w:t>
+      </w:r>
+      <w:r>
+        <w:rPr>
+          <w:sz w:val="20"/>
+          <w:szCs w:val="20"/>
+        </w:rPr>
+        <w:t>154</w:t>
+      </w:r>
+    </w:p>
+    <w:p>
+      <w:pPr>
+        <w:spacing w:after="0"/>
+        <w:rPr>
+          <w:sz w:val="20"/>
+          <w:szCs w:val="20"/>
+        </w:rPr>
+      </w:pPr>
+      <w:r>
+        <w:rPr>
+          <w:sz w:val="20"/>
+          <w:szCs w:val="20"/>
+        </w:rPr>
+        <w:t>k=7 → 0.</w:t>
+      </w:r>
+      <w:r>
+        <w:rPr>
+          <w:sz w:val="20"/>
+          <w:szCs w:val="20"/>
+        </w:rPr>
+        <w:t>148</w:t>
+      </w:r>
+    </w:p>
+    <w:p>
+      <w:pPr>
+        <w:spacing w:after="0"/>
+        <w:rPr>
+          <w:sz w:val="20"/>
+          <w:szCs w:val="20"/>
+        </w:rPr>
+      </w:pPr>
+      <w:r>
+        <w:rPr>
+          <w:sz w:val="20"/>
+          <w:szCs w:val="20"/>
+        </w:rPr>
+        <w:t>k=8 → 0.</w:t>
+      </w:r>
+      <w:r>
+        <w:rPr>
+          <w:sz w:val="20"/>
+          <w:szCs w:val="20"/>
+        </w:rPr>
+        <w:t>154</w:t>
+      </w:r>
+    </w:p>
+    <w:p>
+      <w:pPr>
+        <w:spacing w:after="0"/>
+        <w:rPr>
+          <w:sz w:val="20"/>
+          <w:szCs w:val="20"/>
+        </w:rPr>
+      </w:pPr>
+      <w:r>
+        <w:rPr>
+          <w:sz w:val="20"/>
+          <w:szCs w:val="20"/>
+        </w:rPr>
+        <w:t>k=9 → 0.</w:t>
+      </w:r>
+      <w:r>
+        <w:rPr>
+          <w:sz w:val="20"/>
+          <w:szCs w:val="20"/>
+        </w:rPr>
+        <w:t>174</w:t>
+      </w:r>
+    </w:p>
+    <w:p>
+      <w:pPr>
+        <w:spacing w:after="0"/>
+        <w:rPr>
+          <w:sz w:val="20"/>
+          <w:szCs w:val="20"/>
+        </w:rPr>
+      </w:pPr>
+      <w:r>
+        <w:rPr>
+          <w:sz w:val="20"/>
+          <w:szCs w:val="20"/>
+        </w:rPr>
+        <w:t>k=10 → 0.</w:t>
+      </w:r>
+      <w:r>
+        <w:rPr>
+          <w:sz w:val="20"/>
+          <w:szCs w:val="20"/>
+        </w:rPr>
+        <w:t>174</w:t>
       </w:r>
       <w:r>
         <w:rPr>
@@ -9651,188 +9808,6 @@
         </w:rPr>
         <w:t xml:space="preserve"> </w:t>
       </w:r>
-    </w:p>
-    <w:p>
-      <w:pPr>
-        <w:spacing w:after="0"/>
-        <w:rPr>
-          <w:sz w:val="20"/>
-          <w:szCs w:val="20"/>
-        </w:rPr>
-      </w:pPr>
-      <w:r>
-        <w:rPr>
-          <w:sz w:val="20"/>
-          <w:szCs w:val="20"/>
-        </w:rPr>
-        <w:t>k=4 → 0.</w:t>
-      </w:r>
-      <w:r>
-        <w:rPr>
-          <w:sz w:val="20"/>
-          <w:szCs w:val="20"/>
-        </w:rPr>
-        <w:t>151</w:t>
-      </w:r>
-    </w:p>
-    <w:p>
-      <w:pPr>
-        <w:spacing w:after="0"/>
-        <w:rPr>
-          <w:sz w:val="20"/>
-          <w:szCs w:val="20"/>
-        </w:rPr>
-      </w:pPr>
-      <w:r>
-        <w:rPr>
-          <w:sz w:val="20"/>
-          <w:szCs w:val="20"/>
-        </w:rPr>
-        <w:t>k=5 → 0.</w:t>
-      </w:r>
-      <w:r>
-        <w:rPr>
-          <w:sz w:val="20"/>
-          <w:szCs w:val="20"/>
-        </w:rPr>
-        <w:t>173</w:t>
-      </w:r>
-      <w:r>
-        <w:rPr>
-          <w:sz w:val="20"/>
-          <w:szCs w:val="20"/>
-        </w:rPr>
-        <w:t xml:space="preserve"> </w:t>
-      </w:r>
-    </w:p>
-    <w:p>
-      <w:pPr>
-        <w:spacing w:after="0"/>
-        <w:rPr>
-          <w:sz w:val="20"/>
-          <w:szCs w:val="20"/>
-        </w:rPr>
-      </w:pPr>
-      <w:r>
-        <w:rPr>
-          <w:sz w:val="20"/>
-          <w:szCs w:val="20"/>
-        </w:rPr>
-        <w:t>k=6 → 0.</w:t>
-      </w:r>
-      <w:r>
-        <w:rPr>
-          <w:sz w:val="20"/>
-          <w:szCs w:val="20"/>
-        </w:rPr>
-        <w:t>154</w:t>
-      </w:r>
-    </w:p>
-    <w:p>
-      <w:pPr>
-        <w:spacing w:after="0"/>
-        <w:rPr>
-          <w:sz w:val="20"/>
-          <w:szCs w:val="20"/>
-        </w:rPr>
-      </w:pPr>
-      <w:r>
-        <w:rPr>
-          <w:sz w:val="20"/>
-          <w:szCs w:val="20"/>
-        </w:rPr>
-        <w:t>k=7 → 0.</w:t>
-      </w:r>
-      <w:r>
-        <w:rPr>
-          <w:sz w:val="20"/>
-          <w:szCs w:val="20"/>
-        </w:rPr>
-        <w:t>148</w:t>
-      </w:r>
-    </w:p>
-    <w:p>
-      <w:pPr>
-        <w:spacing w:after="0"/>
-        <w:rPr>
-          <w:sz w:val="20"/>
-          <w:szCs w:val="20"/>
-        </w:rPr>
-      </w:pPr>
-      <w:r>
-        <w:rPr>
-          <w:sz w:val="20"/>
-          <w:szCs w:val="20"/>
-        </w:rPr>
-        <w:t>k=8 → 0.</w:t>
-      </w:r>
-      <w:r>
-        <w:rPr>
-          <w:sz w:val="20"/>
-          <w:szCs w:val="20"/>
-        </w:rPr>
-        <w:t>1</w:t>
-      </w:r>
-      <w:r>
-        <w:rPr>
-          <w:sz w:val="20"/>
-          <w:szCs w:val="20"/>
-        </w:rPr>
-        <w:t>54</w:t>
-      </w:r>
-    </w:p>
-    <w:p>
-      <w:pPr>
-        <w:spacing w:after="0"/>
-        <w:rPr>
-          <w:sz w:val="20"/>
-          <w:szCs w:val="20"/>
-        </w:rPr>
-      </w:pPr>
-      <w:r>
-        <w:rPr>
-          <w:sz w:val="20"/>
-          <w:szCs w:val="20"/>
-        </w:rPr>
-        <w:t>k=9 → 0.</w:t>
-      </w:r>
-      <w:r>
-        <w:rPr>
-          <w:sz w:val="20"/>
-          <w:szCs w:val="20"/>
-        </w:rPr>
-        <w:t>174</w:t>
-      </w:r>
-    </w:p>
-    <w:p>
-      <w:pPr>
-        <w:spacing w:after="0"/>
-        <w:rPr>
-          <w:sz w:val="20"/>
-          <w:szCs w:val="20"/>
-        </w:rPr>
-      </w:pPr>
-      <w:r>
-        <w:rPr>
-          <w:sz w:val="20"/>
-          <w:szCs w:val="20"/>
-        </w:rPr>
-        <w:t>k=10 → 0.</w:t>
-      </w:r>
-      <w:r>
-        <w:rPr>
-          <w:sz w:val="20"/>
-          <w:szCs w:val="20"/>
-        </w:rPr>
-        <w:t>174</w:t>
-      </w:r>
-      <w:r>
-        <w:rPr>
-          <w:sz w:val="20"/>
-          <w:szCs w:val="20"/>
-        </w:rPr>
-        <w:t xml:space="preserve"> </w:t>
-      </w:r>
       <w:r>
         <w:rPr>
           <w:sz w:val="20"/>
@@ -9883,14 +9858,7 @@
           <w:sz w:val="20"/>
           <w:szCs w:val="20"/>
         </w:rPr>
-        <w:t>1</w:t>
-      </w:r>
-      <w:r>
-        <w:rPr>
-          <w:sz w:val="20"/>
-          <w:szCs w:val="20"/>
-        </w:rPr>
-        <w:t>64</w:t>
+        <w:t>164</w:t>
       </w:r>
     </w:p>
     <w:p>
@@ -10122,15 +10090,7 @@
           <w:iCs/>
           <w:u w:val="single"/>
         </w:rPr>
-        <w:t>Manhattan</w:t>
-      </w:r>
-      <w:r>
-        <w:rPr>
-          <w:i/>
-          <w:iCs/>
-          <w:u w:val="single"/>
-        </w:rPr>
-        <w:t xml:space="preserve"> </w:t>
+        <w:t xml:space="preserve">Manhattan </w:t>
       </w:r>
       <w:r>
         <w:rPr>
@@ -10299,21 +10259,7 @@
           <w:sz w:val="20"/>
           <w:szCs w:val="20"/>
         </w:rPr>
-        <w:t>220</w:t>
-      </w:r>
-      <w:r>
-        <w:rPr>
-          <w:sz w:val="20"/>
-          <w:szCs w:val="20"/>
-        </w:rPr>
-        <w:t xml:space="preserve"> </w:t>
-      </w:r>
-      <w:r>
-        <w:rPr>
-          <w:sz w:val="20"/>
-          <w:szCs w:val="20"/>
-        </w:rPr>
-        <w:t>(máximo)</w:t>
+        <w:t>220 (máximo)</w:t>
       </w:r>
     </w:p>
     <w:p>
@@ -10359,14 +10305,7 @@
           <w:sz w:val="20"/>
           <w:szCs w:val="20"/>
         </w:rPr>
-        <w:t>1</w:t>
-      </w:r>
-      <w:r>
-        <w:rPr>
-          <w:sz w:val="20"/>
-          <w:szCs w:val="20"/>
-        </w:rPr>
-        <w:t>87</w:t>
+        <w:t>187</w:t>
       </w:r>
     </w:p>
     <w:p>
@@ -10389,14 +10328,7 @@
           <w:sz w:val="20"/>
           <w:szCs w:val="20"/>
         </w:rPr>
-        <w:t>1</w:t>
-      </w:r>
-      <w:r>
-        <w:rPr>
-          <w:sz w:val="20"/>
-          <w:szCs w:val="20"/>
-        </w:rPr>
-        <w:t>88</w:t>
+        <w:t>188</w:t>
       </w:r>
     </w:p>
     <w:p>
@@ -10419,14 +10351,7 @@
           <w:sz w:val="20"/>
           <w:szCs w:val="20"/>
         </w:rPr>
-        <w:t>1</w:t>
-      </w:r>
-      <w:r>
-        <w:rPr>
-          <w:sz w:val="20"/>
-          <w:szCs w:val="20"/>
-        </w:rPr>
-        <w:t>74</w:t>
+        <w:t>174</w:t>
       </w:r>
     </w:p>
     <w:p>
@@ -10494,14 +10419,7 @@
           <w:sz w:val="20"/>
           <w:szCs w:val="20"/>
         </w:rPr>
-        <w:t>1</w:t>
-      </w:r>
-      <w:r>
-        <w:rPr>
-          <w:sz w:val="20"/>
-          <w:szCs w:val="20"/>
-        </w:rPr>
-        <w:t>69</w:t>
+        <w:t>169</w:t>
       </w:r>
     </w:p>
     <w:p>
@@ -11031,6 +10949,9 @@
         <w:jc w:val="center"/>
       </w:pPr>
       <w:r>
+        <w:rPr>
+          <w:noProof/>
+        </w:rPr>
         <mc:AlternateContent>
           <mc:Choice Requires="wps">
             <w:drawing>
@@ -11763,6 +11684,7 @@
   <w:style w:type="character" w:default="1" w:styleId="Fuentedeprrafopredeter">
     <w:name w:val="Default Paragraph Font"/>
     <w:uiPriority w:val="1"/>
+    <w:semiHidden/>
     <w:unhideWhenUsed/>
   </w:style>
   <w:style w:type="table" w:default="1" w:styleId="Tablanormal">

</xml_diff>